<commit_message>
Updated next year components
</commit_message>
<xml_diff>
--- a/Hardware/Intermiediate Maze.docx
+++ b/Hardware/Intermiediate Maze.docx
@@ -109,7 +109,7 @@
           <w:sz w:val="12"/>
           <w:szCs w:val="12"/>
         </w:rPr>
-        <w:t>Adafruit VL53L4C</w:t>
+        <w:t xml:space="preserve">Adafruit </w:t>
       </w:r>
       <w:r>
         <w:rPr>
@@ -117,7 +117,7 @@
           <w:sz w:val="12"/>
           <w:szCs w:val="12"/>
         </w:rPr>
-        <w:t>X</w:t>
+        <w:t xml:space="preserve">VL53L4CD </w:t>
       </w:r>
       <w:r>
         <w:rPr>
@@ -125,15 +125,7 @@
           <w:sz w:val="12"/>
           <w:szCs w:val="12"/>
         </w:rPr>
-        <w:t xml:space="preserve"> Time of Flight Distance Sensor</w:t>
-      </w:r>
-      <w:r>
-        <w:rPr>
-          <w:rFonts w:ascii="Times New Roman" w:hAnsi="Times New Roman" w:cs="Times New Roman"/>
-          <w:sz w:val="12"/>
-          <w:szCs w:val="12"/>
-        </w:rPr>
-        <w:t xml:space="preserve"> </w:t>
+        <w:t xml:space="preserve">Time of Flight Distance Sensor </w:t>
       </w:r>
       <w:hyperlink r:id="rId8" w:history="1">
         <w:r>
@@ -143,27 +135,7 @@
             <w:sz w:val="12"/>
             <w:szCs w:val="12"/>
           </w:rPr>
-          <w:t xml:space="preserve">Adafruit VL53L4CX Time of Flight Distance Sensor - ~1 to 6000mm [STEMMA QT / </w:t>
-        </w:r>
-        <w:proofErr w:type="spellStart"/>
-        <w:r>
-          <w:rPr>
-            <w:rStyle w:val="Hyperlink"/>
-            <w:rFonts w:ascii="Times New Roman" w:hAnsi="Times New Roman" w:cs="Times New Roman"/>
-            <w:sz w:val="12"/>
-            <w:szCs w:val="12"/>
-          </w:rPr>
-          <w:t>Qwiic</w:t>
-        </w:r>
-        <w:proofErr w:type="spellEnd"/>
-        <w:r>
-          <w:rPr>
-            <w:rStyle w:val="Hyperlink"/>
-            <w:rFonts w:ascii="Times New Roman" w:hAnsi="Times New Roman" w:cs="Times New Roman"/>
-            <w:sz w:val="12"/>
-            <w:szCs w:val="12"/>
-          </w:rPr>
-          <w:t>] : Adafruit Industries, Unique &amp; fun DIY electronics and kits</w:t>
+          <w:t>Adafruit VL53L4CD Time of Flight Distance Sensor - ~1 to 1300mm [STEMMA QT / Qwiic] : Adafruit Industries, Unique &amp; fun DIY electronics and kits</w:t>
         </w:r>
       </w:hyperlink>
     </w:p>
@@ -212,27 +184,7 @@
             <w:sz w:val="12"/>
             <w:szCs w:val="12"/>
           </w:rPr>
-          <w:t xml:space="preserve">Arduino Compatible 9G Micro Servo Motor | </w:t>
-        </w:r>
-        <w:proofErr w:type="spellStart"/>
-        <w:r>
-          <w:rPr>
-            <w:rStyle w:val="Hyperlink"/>
-            <w:rFonts w:ascii="Times New Roman" w:hAnsi="Times New Roman" w:cs="Times New Roman"/>
-            <w:sz w:val="12"/>
-            <w:szCs w:val="12"/>
-          </w:rPr>
-          <w:t>Jaycar</w:t>
-        </w:r>
-        <w:proofErr w:type="spellEnd"/>
-        <w:r>
-          <w:rPr>
-            <w:rStyle w:val="Hyperlink"/>
-            <w:rFonts w:ascii="Times New Roman" w:hAnsi="Times New Roman" w:cs="Times New Roman"/>
-            <w:sz w:val="12"/>
-            <w:szCs w:val="12"/>
-          </w:rPr>
-          <w:t xml:space="preserve"> Australia</w:t>
+          <w:t>Arduino Compatible 9G Micro Servo Motor | Jaycar Australia</w:t>
         </w:r>
       </w:hyperlink>
     </w:p>
@@ -304,7 +256,23 @@
           <w:sz w:val="12"/>
           <w:szCs w:val="12"/>
         </w:rPr>
-        <w:t>Adafruit APDS9960 Proximity, Light, RGB, and Gesture Sensor</w:t>
+        <w:t xml:space="preserve">Adafruit AS7341 10-Channel Light / </w:t>
+      </w:r>
+      <w:r>
+        <w:rPr>
+          <w:rFonts w:ascii="Times New Roman" w:hAnsi="Times New Roman" w:cs="Times New Roman"/>
+          <w:sz w:val="12"/>
+          <w:szCs w:val="12"/>
+        </w:rPr>
+        <w:t>Colour</w:t>
+      </w:r>
+      <w:r>
+        <w:rPr>
+          <w:rFonts w:ascii="Times New Roman" w:hAnsi="Times New Roman" w:cs="Times New Roman"/>
+          <w:sz w:val="12"/>
+          <w:szCs w:val="12"/>
+        </w:rPr>
+        <w:t xml:space="preserve"> Sensor Breakout - STEMMA QT / Qwiic</w:t>
       </w:r>
       <w:r>
         <w:rPr>
@@ -322,7 +290,7 @@
             <w:sz w:val="12"/>
             <w:szCs w:val="12"/>
           </w:rPr>
-          <w:t>Adafruit APDS9960 Proximity, Light, RGB, and Gesture Sensor | Little Bird Electronics</w:t>
+          <w:t>Adafruit AS7341 10-Channel Light / Color Sensor Breakout [STEMMA QT / Qwiic] : Adafruit Industries, Unique &amp; fun DIY electronics and kits</w:t>
         </w:r>
       </w:hyperlink>
     </w:p>
@@ -503,17 +471,7 @@
                 <w:sz w:val="12"/>
                 <w:szCs w:val="12"/>
               </w:rPr>
-              <w:t>Input Voltage</w:t>
-            </w:r>
-            <w:r>
-              <w:rPr>
-                <w:rFonts w:ascii="Times New Roman" w:hAnsi="Times New Roman" w:cs="Times New Roman"/>
-                <w:b/>
-                <w:bCs/>
-                <w:sz w:val="12"/>
-                <w:szCs w:val="12"/>
-              </w:rPr>
-              <w:t xml:space="preserve"> (V)</w:t>
+              <w:t>Input Voltage (V)</w:t>
             </w:r>
           </w:p>
         </w:tc>
@@ -891,15 +849,7 @@
                 <w:sz w:val="12"/>
                 <w:szCs w:val="12"/>
               </w:rPr>
-              <w:t>R</w:t>
-            </w:r>
-            <w:r>
-              <w:rPr>
-                <w:rFonts w:ascii="Times New Roman" w:hAnsi="Times New Roman" w:cs="Times New Roman"/>
-                <w:sz w:val="12"/>
-                <w:szCs w:val="12"/>
-              </w:rPr>
-              <w:t>oll: ±1.0°</w:t>
+              <w:t>Roll: ±1.0°</w:t>
             </w:r>
           </w:p>
           <w:p>
@@ -924,15 +874,7 @@
                 <w:sz w:val="12"/>
                 <w:szCs w:val="12"/>
               </w:rPr>
-              <w:t xml:space="preserve"> </w:t>
-            </w:r>
-            <w:r>
-              <w:rPr>
-                <w:rFonts w:ascii="Times New Roman" w:hAnsi="Times New Roman" w:cs="Times New Roman"/>
-                <w:sz w:val="12"/>
-                <w:szCs w:val="12"/>
-              </w:rPr>
-              <w:t>±1.0°</w:t>
+              <w:t xml:space="preserve"> ±1.0°</w:t>
             </w:r>
           </w:p>
         </w:tc>
@@ -1090,23 +1032,7 @@
                 <w:sz w:val="12"/>
                 <w:szCs w:val="12"/>
               </w:rPr>
-              <w:t>Roll</w:t>
-            </w:r>
-            <w:r>
-              <w:rPr>
-                <w:rFonts w:ascii="Times New Roman" w:hAnsi="Times New Roman" w:cs="Times New Roman"/>
-                <w:sz w:val="12"/>
-                <w:szCs w:val="12"/>
-              </w:rPr>
-              <w:t>:</w:t>
-            </w:r>
-            <w:r>
-              <w:rPr>
-                <w:rFonts w:ascii="Times New Roman" w:hAnsi="Times New Roman" w:cs="Times New Roman"/>
-                <w:sz w:val="12"/>
-                <w:szCs w:val="12"/>
-              </w:rPr>
-              <w:t xml:space="preserve"> ±2.0° to ±3.0°</w:t>
+              <w:t>Roll: ±2.0° to ±3.0°</w:t>
             </w:r>
           </w:p>
           <w:p>
@@ -1674,23 +1600,13 @@
                 <w:szCs w:val="12"/>
               </w:rPr>
             </w:pPr>
-            <w:proofErr w:type="spellStart"/>
-            <w:r>
-              <w:rPr>
-                <w:rFonts w:ascii="Times New Roman" w:hAnsi="Times New Roman" w:cs="Times New Roman"/>
-                <w:sz w:val="12"/>
-                <w:szCs w:val="12"/>
-              </w:rPr>
-              <w:t>Pololu</w:t>
-            </w:r>
-            <w:proofErr w:type="spellEnd"/>
-            <w:r>
-              <w:rPr>
-                <w:rFonts w:ascii="Times New Roman" w:hAnsi="Times New Roman" w:cs="Times New Roman"/>
-                <w:sz w:val="12"/>
-                <w:szCs w:val="12"/>
-              </w:rPr>
-              <w:t xml:space="preserve"> (VL53L0X ) Carrier</w:t>
+            <w:r>
+              <w:rPr>
+                <w:rFonts w:ascii="Times New Roman" w:hAnsi="Times New Roman" w:cs="Times New Roman"/>
+                <w:sz w:val="12"/>
+                <w:szCs w:val="12"/>
+              </w:rPr>
+              <w:t>Pololu (VL53L0X ) Carrier</w:t>
             </w:r>
           </w:p>
         </w:tc>
@@ -1958,25 +1874,7 @@
                 <w:sz w:val="12"/>
                 <w:szCs w:val="12"/>
               </w:rPr>
-              <w:t xml:space="preserve">Reads right down to 1 mm and fast 100 </w:t>
-            </w:r>
-            <w:proofErr w:type="spellStart"/>
-            <w:r>
-              <w:rPr>
-                <w:rFonts w:ascii="Times New Roman" w:hAnsi="Times New Roman" w:cs="Times New Roman"/>
-                <w:sz w:val="12"/>
-                <w:szCs w:val="12"/>
-              </w:rPr>
-              <w:t>hz</w:t>
-            </w:r>
-            <w:proofErr w:type="spellEnd"/>
-            <w:r>
-              <w:rPr>
-                <w:rFonts w:ascii="Times New Roman" w:hAnsi="Times New Roman" w:cs="Times New Roman"/>
-                <w:sz w:val="12"/>
-                <w:szCs w:val="12"/>
-              </w:rPr>
-              <w:t xml:space="preserve"> rate</w:t>
+              <w:t>Reads right down to 1 mm and fast 100 hz rate</w:t>
             </w:r>
           </w:p>
         </w:tc>
@@ -2194,23 +2092,13 @@
                 <w:szCs w:val="12"/>
               </w:rPr>
             </w:pPr>
-            <w:proofErr w:type="spellStart"/>
-            <w:r>
-              <w:rPr>
-                <w:rFonts w:ascii="Times New Roman" w:hAnsi="Times New Roman" w:cs="Times New Roman"/>
-                <w:sz w:val="12"/>
-                <w:szCs w:val="12"/>
-              </w:rPr>
-              <w:t>PiicoDev</w:t>
-            </w:r>
-            <w:proofErr w:type="spellEnd"/>
-            <w:r>
-              <w:rPr>
-                <w:rFonts w:ascii="Times New Roman" w:hAnsi="Times New Roman" w:cs="Times New Roman"/>
-                <w:sz w:val="12"/>
-                <w:szCs w:val="12"/>
-              </w:rPr>
-              <w:t xml:space="preserve"> (VL53L1X)</w:t>
+            <w:r>
+              <w:rPr>
+                <w:rFonts w:ascii="Times New Roman" w:hAnsi="Times New Roman" w:cs="Times New Roman"/>
+                <w:sz w:val="12"/>
+                <w:szCs w:val="12"/>
+              </w:rPr>
+              <w:t>PiicoDev (VL53L1X)</w:t>
             </w:r>
           </w:p>
         </w:tc>
@@ -3149,41 +3037,13 @@
                 <w:szCs w:val="12"/>
               </w:rPr>
             </w:pPr>
-            <w:proofErr w:type="spellStart"/>
-            <w:r>
-              <w:rPr>
-                <w:rFonts w:ascii="Times New Roman" w:hAnsi="Times New Roman" w:cs="Times New Roman"/>
-                <w:sz w:val="12"/>
-                <w:szCs w:val="12"/>
-              </w:rPr>
-              <w:t>Tribotix</w:t>
-            </w:r>
-            <w:proofErr w:type="spellEnd"/>
-            <w:r>
-              <w:rPr>
-                <w:rFonts w:ascii="Times New Roman" w:hAnsi="Times New Roman" w:cs="Times New Roman"/>
-                <w:sz w:val="12"/>
-                <w:szCs w:val="12"/>
-              </w:rPr>
-              <w:t xml:space="preserve"> </w:t>
-            </w:r>
-            <w:proofErr w:type="spellStart"/>
-            <w:r>
-              <w:rPr>
-                <w:rFonts w:ascii="Times New Roman" w:hAnsi="Times New Roman" w:cs="Times New Roman"/>
-                <w:sz w:val="12"/>
-                <w:szCs w:val="12"/>
-              </w:rPr>
-              <w:t>Dynamixel</w:t>
-            </w:r>
-            <w:proofErr w:type="spellEnd"/>
-            <w:r>
-              <w:rPr>
-                <w:rFonts w:ascii="Times New Roman" w:hAnsi="Times New Roman" w:cs="Times New Roman"/>
-                <w:sz w:val="12"/>
-                <w:szCs w:val="12"/>
-              </w:rPr>
-              <w:t xml:space="preserve"> (XC430-W150-T)</w:t>
+            <w:r>
+              <w:rPr>
+                <w:rFonts w:ascii="Times New Roman" w:hAnsi="Times New Roman" w:cs="Times New Roman"/>
+                <w:sz w:val="12"/>
+                <w:szCs w:val="12"/>
+              </w:rPr>
+              <w:t>Tribotix Dynamixel (XC430-W150-T)</w:t>
             </w:r>
           </w:p>
         </w:tc>
@@ -3867,6 +3727,14 @@
               </w:rPr>
               <w:t>Adafruit (APDS-9960)</w:t>
             </w:r>
+            <w:r>
+              <w:rPr>
+                <w:rFonts w:ascii="Times New Roman" w:hAnsi="Times New Roman" w:cs="Times New Roman"/>
+                <w:sz w:val="12"/>
+                <w:szCs w:val="12"/>
+              </w:rPr>
+              <w:t xml:space="preserve"> </w:t>
+            </w:r>
           </w:p>
         </w:tc>
         <w:tc>
@@ -3932,6 +3800,193 @@
                 <w:szCs w:val="12"/>
               </w:rPr>
               <w:t>2.4V – 3.6V</w:t>
+            </w:r>
+          </w:p>
+        </w:tc>
+        <w:tc>
+          <w:tcPr>
+            <w:tcW w:w="1292" w:type="dxa"/>
+          </w:tcPr>
+          <w:p>
+            <w:pPr>
+              <w:rPr>
+                <w:rFonts w:ascii="Times New Roman" w:hAnsi="Times New Roman" w:cs="Times New Roman"/>
+                <w:sz w:val="12"/>
+                <w:szCs w:val="12"/>
+              </w:rPr>
+            </w:pPr>
+            <w:r>
+              <w:rPr>
+                <w:rFonts w:ascii="Times New Roman" w:hAnsi="Times New Roman" w:cs="Times New Roman"/>
+                <w:sz w:val="12"/>
+                <w:szCs w:val="12"/>
+              </w:rPr>
+              <w:t>Not specified</w:t>
+            </w:r>
+          </w:p>
+          <w:p>
+            <w:pPr>
+              <w:rPr>
+                <w:rFonts w:ascii="Times New Roman" w:hAnsi="Times New Roman" w:cs="Times New Roman"/>
+                <w:sz w:val="12"/>
+                <w:szCs w:val="12"/>
+              </w:rPr>
+            </w:pPr>
+          </w:p>
+        </w:tc>
+      </w:tr>
+      <w:tr>
+        <w:tc>
+          <w:tcPr>
+            <w:tcW w:w="1493" w:type="dxa"/>
+          </w:tcPr>
+          <w:p>
+            <w:pPr>
+              <w:rPr>
+                <w:rFonts w:ascii="Times New Roman" w:hAnsi="Times New Roman" w:cs="Times New Roman"/>
+                <w:b/>
+                <w:bCs/>
+                <w:sz w:val="12"/>
+                <w:szCs w:val="12"/>
+              </w:rPr>
+            </w:pPr>
+            <w:r>
+              <w:rPr>
+                <w:rFonts w:ascii="Times New Roman" w:hAnsi="Times New Roman" w:cs="Times New Roman"/>
+                <w:b/>
+                <w:bCs/>
+                <w:sz w:val="12"/>
+                <w:szCs w:val="12"/>
+              </w:rPr>
+              <w:t>Product 4</w:t>
+            </w:r>
+          </w:p>
+        </w:tc>
+        <w:tc>
+          <w:tcPr>
+            <w:tcW w:w="1572" w:type="dxa"/>
+          </w:tcPr>
+          <w:p>
+            <w:pPr>
+              <w:rPr>
+                <w:rFonts w:ascii="Times New Roman" w:hAnsi="Times New Roman" w:cs="Times New Roman"/>
+                <w:sz w:val="12"/>
+                <w:szCs w:val="12"/>
+              </w:rPr>
+            </w:pPr>
+            <w:r>
+              <w:rPr>
+                <w:rFonts w:ascii="Times New Roman" w:hAnsi="Times New Roman" w:cs="Times New Roman"/>
+                <w:sz w:val="12"/>
+                <w:szCs w:val="12"/>
+              </w:rPr>
+              <w:t>Adafruit (AS7341)</w:t>
+            </w:r>
+          </w:p>
+        </w:tc>
+        <w:tc>
+          <w:tcPr>
+            <w:tcW w:w="1650" w:type="dxa"/>
+          </w:tcPr>
+          <w:p>
+            <w:pPr>
+              <w:rPr>
+                <w:rFonts w:ascii="Times New Roman" w:hAnsi="Times New Roman" w:cs="Times New Roman"/>
+                <w:sz w:val="12"/>
+                <w:szCs w:val="12"/>
+              </w:rPr>
+            </w:pPr>
+            <w:r>
+              <w:rPr>
+                <w:rFonts w:ascii="Times New Roman" w:hAnsi="Times New Roman" w:cs="Times New Roman"/>
+                <w:sz w:val="12"/>
+                <w:szCs w:val="12"/>
+              </w:rPr>
+              <w:t>Robust Software Libraries</w:t>
+            </w:r>
+            <w:r>
+              <w:rPr>
+                <w:rFonts w:ascii="Times New Roman" w:hAnsi="Times New Roman" w:cs="Times New Roman"/>
+                <w:sz w:val="12"/>
+                <w:szCs w:val="12"/>
+              </w:rPr>
+              <w:t xml:space="preserve"> and </w:t>
+            </w:r>
+            <w:r>
+              <w:rPr>
+                <w:rFonts w:ascii="Times New Roman" w:hAnsi="Times New Roman" w:cs="Times New Roman"/>
+                <w:sz w:val="12"/>
+                <w:szCs w:val="12"/>
+              </w:rPr>
+              <w:t>m</w:t>
+            </w:r>
+            <w:r>
+              <w:rPr>
+                <w:rFonts w:ascii="Times New Roman" w:hAnsi="Times New Roman" w:cs="Times New Roman"/>
+                <w:sz w:val="12"/>
+                <w:szCs w:val="12"/>
+              </w:rPr>
+              <w:t>ulti-Spectral Precision</w:t>
+            </w:r>
+          </w:p>
+        </w:tc>
+        <w:tc>
+          <w:tcPr>
+            <w:tcW w:w="1619" w:type="dxa"/>
+          </w:tcPr>
+          <w:p>
+            <w:pPr>
+              <w:rPr>
+                <w:rFonts w:ascii="Times New Roman" w:hAnsi="Times New Roman" w:cs="Times New Roman"/>
+                <w:sz w:val="12"/>
+                <w:szCs w:val="12"/>
+              </w:rPr>
+            </w:pPr>
+            <w:r>
+              <w:rPr>
+                <w:rFonts w:ascii="Times New Roman" w:hAnsi="Times New Roman" w:cs="Times New Roman"/>
+                <w:sz w:val="12"/>
+                <w:szCs w:val="12"/>
+              </w:rPr>
+              <w:t xml:space="preserve">Wide field of view means we have to go close to </w:t>
+            </w:r>
+            <w:r>
+              <w:rPr>
+                <w:rFonts w:ascii="Times New Roman" w:hAnsi="Times New Roman" w:cs="Times New Roman"/>
+                <w:sz w:val="12"/>
+                <w:szCs w:val="12"/>
+              </w:rPr>
+              <w:t xml:space="preserve">what we are sensing and </w:t>
+            </w:r>
+            <w:r>
+              <w:rPr>
+                <w:rFonts w:ascii="Times New Roman" w:hAnsi="Times New Roman" w:cs="Times New Roman"/>
+                <w:sz w:val="12"/>
+                <w:szCs w:val="12"/>
+              </w:rPr>
+              <w:t>uses a lot of memory</w:t>
+            </w:r>
+          </w:p>
+        </w:tc>
+        <w:tc>
+          <w:tcPr>
+            <w:tcW w:w="1395" w:type="dxa"/>
+          </w:tcPr>
+          <w:p>
+            <w:pPr>
+              <w:rPr>
+                <w:rFonts w:ascii="Times New Roman" w:hAnsi="Times New Roman" w:cs="Times New Roman"/>
+                <w:sz w:val="12"/>
+                <w:szCs w:val="12"/>
+              </w:rPr>
+            </w:pPr>
+            <w:r>
+              <w:rPr>
+                <w:rFonts w:ascii="Times New Roman" w:hAnsi="Times New Roman" w:cs="Times New Roman"/>
+                <w:sz w:val="12"/>
+                <w:szCs w:val="12"/>
+              </w:rPr>
+              <w:t>3V DC– 5V DC</w:t>
             </w:r>
           </w:p>
         </w:tc>
@@ -4013,7 +4068,6 @@
           <w:sz w:val="12"/>
           <w:szCs w:val="12"/>
         </w:rPr>
-        <w:lastRenderedPageBreak/>
         <w:t>Servo</w:t>
       </w:r>
     </w:p>
@@ -4196,27 +4250,7 @@
                 <w:sz w:val="12"/>
                 <w:szCs w:val="12"/>
               </w:rPr>
-              <w:t>S</w:t>
-            </w:r>
-            <w:r>
-              <w:rPr>
-                <w:rFonts w:ascii="Times New Roman" w:hAnsi="Times New Roman" w:cs="Times New Roman"/>
-                <w:b/>
-                <w:bCs/>
-                <w:sz w:val="12"/>
-                <w:szCs w:val="12"/>
-              </w:rPr>
-              <w:t>tall Torq</w:t>
-            </w:r>
-            <w:r>
-              <w:rPr>
-                <w:rFonts w:ascii="Times New Roman" w:hAnsi="Times New Roman" w:cs="Times New Roman"/>
-                <w:b/>
-                <w:bCs/>
-                <w:sz w:val="12"/>
-                <w:szCs w:val="12"/>
-              </w:rPr>
-              <w:t>ue</w:t>
+              <w:t>Stall Torque</w:t>
             </w:r>
           </w:p>
         </w:tc>
@@ -4266,23 +4300,13 @@
                 <w:szCs w:val="12"/>
               </w:rPr>
             </w:pPr>
-            <w:proofErr w:type="spellStart"/>
-            <w:r>
-              <w:rPr>
-                <w:rFonts w:ascii="Times New Roman" w:hAnsi="Times New Roman" w:cs="Times New Roman"/>
-                <w:sz w:val="12"/>
-                <w:szCs w:val="12"/>
-              </w:rPr>
-              <w:t>Feetech</w:t>
-            </w:r>
-            <w:proofErr w:type="spellEnd"/>
-            <w:r>
-              <w:rPr>
-                <w:rFonts w:ascii="Times New Roman" w:hAnsi="Times New Roman" w:cs="Times New Roman"/>
-                <w:sz w:val="12"/>
-                <w:szCs w:val="12"/>
-              </w:rPr>
-              <w:t xml:space="preserve"> (FT90R)</w:t>
+            <w:r>
+              <w:rPr>
+                <w:rFonts w:ascii="Times New Roman" w:hAnsi="Times New Roman" w:cs="Times New Roman"/>
+                <w:sz w:val="12"/>
+                <w:szCs w:val="12"/>
+              </w:rPr>
+              <w:t>Feetech (FT90R)</w:t>
             </w:r>
           </w:p>
         </w:tc>
@@ -4382,25 +4406,7 @@
                 <w:sz w:val="12"/>
                 <w:szCs w:val="12"/>
               </w:rPr>
-              <w:t xml:space="preserve">1.3 </w:t>
-            </w:r>
-            <w:proofErr w:type="spellStart"/>
-            <w:r>
-              <w:rPr>
-                <w:rFonts w:ascii="Times New Roman" w:hAnsi="Times New Roman" w:cs="Times New Roman"/>
-                <w:sz w:val="12"/>
-                <w:szCs w:val="12"/>
-              </w:rPr>
-              <w:t>kg·cm</w:t>
-            </w:r>
-            <w:proofErr w:type="spellEnd"/>
-            <w:r>
-              <w:rPr>
-                <w:rFonts w:ascii="Times New Roman" w:hAnsi="Times New Roman" w:cs="Times New Roman"/>
-                <w:sz w:val="12"/>
-                <w:szCs w:val="12"/>
-              </w:rPr>
-              <w:t xml:space="preserve"> at </w:t>
+              <w:t xml:space="preserve">1.3 kg·cm at </w:t>
             </w:r>
             <w:r>
               <w:rPr>
@@ -4425,25 +4431,7 @@
                 <w:sz w:val="12"/>
                 <w:szCs w:val="12"/>
               </w:rPr>
-              <w:t xml:space="preserve">1.5 </w:t>
-            </w:r>
-            <w:proofErr w:type="spellStart"/>
-            <w:r>
-              <w:rPr>
-                <w:rFonts w:ascii="Times New Roman" w:hAnsi="Times New Roman" w:cs="Times New Roman"/>
-                <w:sz w:val="12"/>
-                <w:szCs w:val="12"/>
-              </w:rPr>
-              <w:t>kg·cm</w:t>
-            </w:r>
-            <w:proofErr w:type="spellEnd"/>
-            <w:r>
-              <w:rPr>
-                <w:rFonts w:ascii="Times New Roman" w:hAnsi="Times New Roman" w:cs="Times New Roman"/>
-                <w:sz w:val="12"/>
-                <w:szCs w:val="12"/>
-              </w:rPr>
-              <w:t xml:space="preserve"> at 6V</w:t>
+              <w:t>1.5 kg·cm at 6V</w:t>
             </w:r>
           </w:p>
         </w:tc>
@@ -4581,68 +4569,24 @@
                 <w:sz w:val="12"/>
                 <w:szCs w:val="12"/>
               </w:rPr>
-              <w:t xml:space="preserve">1.6 </w:t>
-            </w:r>
-            <w:proofErr w:type="spellStart"/>
-            <w:r>
-              <w:rPr>
-                <w:rFonts w:ascii="Times New Roman" w:hAnsi="Times New Roman" w:cs="Times New Roman"/>
-                <w:sz w:val="12"/>
-                <w:szCs w:val="12"/>
-              </w:rPr>
-              <w:t>kg·cm</w:t>
-            </w:r>
-            <w:proofErr w:type="spellEnd"/>
-            <w:r>
-              <w:rPr>
-                <w:rFonts w:ascii="Times New Roman" w:hAnsi="Times New Roman" w:cs="Times New Roman"/>
-                <w:sz w:val="12"/>
-                <w:szCs w:val="12"/>
-              </w:rPr>
-              <w:t xml:space="preserve"> at 4.8V</w:t>
-            </w:r>
-          </w:p>
-          <w:p>
-            <w:pPr>
-              <w:rPr>
-                <w:rFonts w:ascii="Times New Roman" w:hAnsi="Times New Roman" w:cs="Times New Roman"/>
-                <w:sz w:val="12"/>
-                <w:szCs w:val="12"/>
-              </w:rPr>
-            </w:pPr>
-            <w:r>
-              <w:rPr>
-                <w:rFonts w:ascii="Times New Roman" w:hAnsi="Times New Roman" w:cs="Times New Roman"/>
-                <w:sz w:val="12"/>
-                <w:szCs w:val="12"/>
-              </w:rPr>
-              <w:t>1</w:t>
-            </w:r>
-            <w:r>
-              <w:rPr>
-                <w:rFonts w:ascii="Times New Roman" w:hAnsi="Times New Roman" w:cs="Times New Roman"/>
-                <w:sz w:val="12"/>
-                <w:szCs w:val="12"/>
-              </w:rPr>
-              <w:t xml:space="preserve">.9 </w:t>
-            </w:r>
-            <w:proofErr w:type="spellStart"/>
-            <w:r>
-              <w:rPr>
-                <w:rFonts w:ascii="Times New Roman" w:hAnsi="Times New Roman" w:cs="Times New Roman"/>
-                <w:sz w:val="12"/>
-                <w:szCs w:val="12"/>
-              </w:rPr>
-              <w:t>kg·cm</w:t>
-            </w:r>
-            <w:proofErr w:type="spellEnd"/>
-            <w:r>
-              <w:rPr>
-                <w:rFonts w:ascii="Times New Roman" w:hAnsi="Times New Roman" w:cs="Times New Roman"/>
-                <w:sz w:val="12"/>
-                <w:szCs w:val="12"/>
-              </w:rPr>
-              <w:t xml:space="preserve"> at 6V</w:t>
+              <w:t>1.6 kg·cm at 4.8V</w:t>
+            </w:r>
+          </w:p>
+          <w:p>
+            <w:pPr>
+              <w:rPr>
+                <w:rFonts w:ascii="Times New Roman" w:hAnsi="Times New Roman" w:cs="Times New Roman"/>
+                <w:sz w:val="12"/>
+                <w:szCs w:val="12"/>
+              </w:rPr>
+            </w:pPr>
+            <w:r>
+              <w:rPr>
+                <w:rFonts w:ascii="Times New Roman" w:hAnsi="Times New Roman" w:cs="Times New Roman"/>
+                <w:sz w:val="12"/>
+                <w:szCs w:val="12"/>
+              </w:rPr>
+              <w:t>1.9 kg·cm at 6V</w:t>
             </w:r>
           </w:p>
         </w:tc>
@@ -4974,15 +4918,7 @@
                 <w:sz w:val="12"/>
                 <w:szCs w:val="12"/>
               </w:rPr>
-              <w:t>Fails instantly with 5V</w:t>
-            </w:r>
-            <w:r>
-              <w:rPr>
-                <w:rFonts w:ascii="Times New Roman" w:hAnsi="Times New Roman" w:cs="Times New Roman"/>
-                <w:sz w:val="12"/>
-                <w:szCs w:val="12"/>
-              </w:rPr>
-              <w:t xml:space="preserve"> and </w:t>
+              <w:t xml:space="preserve">Fails instantly with 5V and </w:t>
             </w:r>
             <w:r>
               <w:rPr>
@@ -5161,15 +5097,7 @@
                 <w:sz w:val="12"/>
                 <w:szCs w:val="12"/>
               </w:rPr>
-              <w:t xml:space="preserve"> and massive </w:t>
-            </w:r>
-            <w:r>
-              <w:rPr>
-                <w:rFonts w:ascii="Times New Roman" w:hAnsi="Times New Roman" w:cs="Times New Roman"/>
-                <w:sz w:val="12"/>
-                <w:szCs w:val="12"/>
-              </w:rPr>
-              <w:t>I/O capability.</w:t>
+              <w:t xml:space="preserve"> and massive I/O capability.</w:t>
             </w:r>
           </w:p>
         </w:tc>
@@ -5348,15 +5276,7 @@
                 <w:sz w:val="12"/>
                 <w:szCs w:val="12"/>
               </w:rPr>
-              <w:t>Native 5V logic compatibility</w:t>
-            </w:r>
-            <w:r>
-              <w:rPr>
-                <w:rFonts w:ascii="Times New Roman" w:hAnsi="Times New Roman" w:cs="Times New Roman"/>
-                <w:sz w:val="12"/>
-                <w:szCs w:val="12"/>
-              </w:rPr>
-              <w:t xml:space="preserve"> and is very plug and play</w:t>
+              <w:t>Native 5V logic compatibility and is very plug and play</w:t>
             </w:r>
           </w:p>
         </w:tc>
@@ -5513,7 +5433,7 @@
   <w:abstractNum w:abstractNumId="0" w15:restartNumberingAfterBreak="0">
     <w:nsid w:val="37003ADC"/>
     <w:multiLevelType w:val="hybridMultilevel"/>
-    <w:tmpl w:val="137CE620"/>
+    <w:tmpl w:val="EA520AF8"/>
     <w:lvl w:ilvl="0" w:tplc="0C090001">
       <w:start w:val="1"/>
       <w:numFmt w:val="bullet"/>

</xml_diff>